<commit_message>
GUI help, About box and beta notice; docs updated
- hover tooltips on every control, F1 / ? Help window per tab
- About: version 0.9 beta, developer, unsupported beta notice, repo link
- README.md, vwbhist/README.txt: rewritten for the window, beta status
- tech note: new procedure for the folder-vs-master window (with
  screenshot), window steps in the compare and history procedures,
  help section, beta/unsupported limitation, repository reference
</commit_message>
<xml_diff>
--- a/EPT_TechNote_XXX_pVWB_Setup_Comparison.docx
+++ b/EPT_TechNote_XXX_pVWB_Setup_Comparison.docx
@@ -183,7 +183,7 @@
         <w:t xml:space="preserve">vwbhist.py</w:t>
       </w:r>
       <w:r>
-        <w:t xml:space="preserve"> described in this note does this and also keeps a version history of a workbench. It only reads workbench files and never modifies them.</w:t>
+        <w:t xml:space="preserve"> described in this note does this and also keeps a version history of a workbench. A companion window, vwbhist_gui.py, does the same without typing commands: it checks a whole folder of workbenches against a master workbench, keeps the version history and compares any two files. Both only read workbench files and never modify them.</w:t>
       </w:r>
     </w:p>
     <w:p>
@@ -775,7 +775,29 @@
         <w:t xml:space="preserve">vwbhist.py</w:t>
       </w:r>
       <w:r>
-        <w:t xml:space="preserve">, the launchers </w:t>
+        <w:t xml:space="preserve"> (engine and command line), </w:t>
+      </w:r>
+      <w:r>
+        <w:rPr>
+          <w:rFonts w:ascii="Consolas" w:hAnsi="Consolas" w:cs="Consolas"/>
+          <w:sz w:val="18"/>
+          <w:szCs w:val="18"/>
+        </w:rPr>
+        <w:t xml:space="preserve">vwbhist_gui.py</w:t>
+      </w:r>
+      <w:r>
+        <w:t xml:space="preserve"> (window), the launchers </w:t>
+      </w:r>
+      <w:r>
+        <w:rPr>
+          <w:rFonts w:ascii="Consolas" w:hAnsi="Consolas" w:cs="Consolas"/>
+          <w:sz w:val="18"/>
+          <w:szCs w:val="18"/>
+        </w:rPr>
+        <w:t xml:space="preserve">vwbhist_gui.bat</w:t>
+      </w:r>
+      <w:r>
+        <w:t xml:space="preserve">, </w:t>
       </w:r>
       <w:r>
         <w:rPr>
@@ -819,7 +841,15 @@
         <w:t xml:space="preserve">README.txt</w:t>
       </w:r>
       <w:r>
-        <w:t xml:space="preserve">. Unzip it to a folder such as </w:t>
+        <w:t xml:space="preserve">. Unzip it to a folder such as C:\Tools\vwbhist. The current version is available from https://github.com/krhorne/vwbhist.</w:t>
+      </w:r>
+    </w:p>
+    <w:p>
+      <w:pPr>
+        <w:pStyle w:val="ListBullet"/>
+      </w:pPr>
+      <w:r>
+        <w:t xml:space="preserve">Optional: the </w:t>
       </w:r>
       <w:r>
         <w:rPr>
@@ -827,10 +857,21 @@
           <w:sz w:val="18"/>
           <w:szCs w:val="18"/>
         </w:rPr>
-        <w:t xml:space="preserve">C:\Tools\vwbhist</w:t>
+        <w:t xml:space="preserve">sv-ttk</w:t>
       </w:r>
       <w:r>
-        <w:t xml:space="preserve">.</w:t>
+        <w:t xml:space="preserve"> package (</w:t>
+      </w:r>
+      <w:r>
+        <w:rPr>
+          <w:rFonts w:ascii="Consolas" w:hAnsi="Consolas" w:cs="Consolas"/>
+          <w:sz w:val="18"/>
+          <w:szCs w:val="18"/>
+        </w:rPr>
+        <w:t xml:space="preserve">pip install sv-ttk</w:t>
+      </w:r>
+      <w:r>
+        <w:t xml:space="preserve">) gives the window a Windows 11 look that follows the Windows light or dark setting. Without it the window uses the standard look.</w:t>
       </w:r>
     </w:p>
     <w:p>
@@ -846,7 +887,293 @@
         <w:pStyle w:val="Heading3"/>
       </w:pPr>
       <w:r>
-        <w:t xml:space="preserve">Procedure 1: compare two workbenches</w:t>
+        <w:t xml:space="preserve">Procedure 1: check a folder of workbenches against a master workbench</w:t>
+      </w:r>
+    </w:p>
+    <w:p>
+      <w:pPr>
+        <w:spacing w:after="120"/>
+      </w:pPr>
+      <w:r>
+        <w:t xml:space="preserve">The quickest way to find setup differences across several test cells is to keep the workbenches of all cells in one folder (or one sub-folder per cell) and compare each of them with a master ("golden") workbench. This is done in the vwbhist window.</w:t>
+      </w:r>
+    </w:p>
+    <w:p>
+      <w:pPr>
+        <w:pStyle w:val="ListNumber"/>
+        <w:numPr>
+          <w:ilvl w:val="0"/>
+          <w:numId w:val="103"/>
+        </w:numPr>
+      </w:pPr>
+      <w:r>
+        <w:t xml:space="preserve">Double-click </w:t>
+      </w:r>
+      <w:r>
+        <w:rPr>
+          <w:rFonts w:ascii="Consolas" w:hAnsi="Consolas" w:cs="Consolas"/>
+          <w:sz w:val="18"/>
+          <w:szCs w:val="18"/>
+        </w:rPr>
+        <w:t xml:space="preserve">vwbhist_gui.bat</w:t>
+      </w:r>
+      <w:r>
+        <w:t xml:space="preserve">. The window opens on the </w:t>
+      </w:r>
+      <w:r>
+        <w:rPr>
+          <w:b/>
+        </w:rPr>
+        <w:t xml:space="preserve">Folder vs reference</w:t>
+      </w:r>
+      <w:r>
+        <w:t xml:space="preserve"> tab.</w:t>
+      </w:r>
+    </w:p>
+    <w:p>
+      <w:pPr>
+        <w:pStyle w:val="ListNumber"/>
+        <w:numPr>
+          <w:ilvl w:val="0"/>
+          <w:numId w:val="103"/>
+        </w:numPr>
+      </w:pPr>
+      <w:r>
+        <w:t xml:space="preserve">Next to </w:t>
+      </w:r>
+      <w:r>
+        <w:rPr>
+          <w:b/>
+        </w:rPr>
+        <w:t xml:space="preserve">Folder</w:t>
+      </w:r>
+      <w:r>
+        <w:t xml:space="preserve">, click </w:t>
+      </w:r>
+      <w:r>
+        <w:rPr>
+          <w:b/>
+        </w:rPr>
+        <w:t xml:space="preserve">Browse…</w:t>
+      </w:r>
+      <w:r>
+        <w:t xml:space="preserve"> and select the folder that holds the workbenches. Sub-folders are included; the tree lists every .pVWB and .pSet file.</w:t>
+      </w:r>
+    </w:p>
+    <w:p>
+      <w:pPr>
+        <w:pStyle w:val="ListNumber"/>
+        <w:numPr>
+          <w:ilvl w:val="0"/>
+          <w:numId w:val="103"/>
+        </w:numPr>
+      </w:pPr>
+      <w:r>
+        <w:t xml:space="preserve">Select the master workbench in the tree and click </w:t>
+      </w:r>
+      <w:r>
+        <w:rPr>
+          <w:b/>
+        </w:rPr>
+        <w:t xml:space="preserve">Use selected file</w:t>
+      </w:r>
+      <w:r>
+        <w:t xml:space="preserve"> (or right-click it and choose </w:t>
+      </w:r>
+      <w:r>
+        <w:rPr>
+          <w:b/>
+        </w:rPr>
+        <w:t xml:space="preserve">Set as reference</w:t>
+      </w:r>
+      <w:r>
+        <w:t xml:space="preserve">). A master stored elsewhere can be chosen with the </w:t>
+      </w:r>
+      <w:r>
+        <w:rPr>
+          <w:b/>
+        </w:rPr>
+        <w:t xml:space="preserve">Browse…</w:t>
+      </w:r>
+      <w:r>
+        <w:t xml:space="preserve"> button next to </w:t>
+      </w:r>
+      <w:r>
+        <w:rPr>
+          <w:b/>
+        </w:rPr>
+        <w:t xml:space="preserve">Reference</w:t>
+      </w:r>
+      <w:r>
+        <w:t xml:space="preserve">.</w:t>
+      </w:r>
+    </w:p>
+    <w:p>
+      <w:pPr>
+        <w:pStyle w:val="ListNumber"/>
+        <w:numPr>
+          <w:ilvl w:val="0"/>
+          <w:numId w:val="103"/>
+        </w:numPr>
+      </w:pPr>
+      <w:r>
+        <w:t xml:space="preserve">Every other file is compared with the master and marked in the tree: ★ reference, ✓ same as reference, ≠ N differences, or cannot read (a damaged file, a file still being written, or not a workbench). Each sub-folder shows how many of its files differ, and the totals are shown above the tree.</w:t>
+      </w:r>
+    </w:p>
+    <w:p>
+      <w:pPr>
+        <w:pStyle w:val="ListNumber"/>
+        <w:numPr>
+          <w:ilvl w:val="0"/>
+          <w:numId w:val="103"/>
+        </w:numPr>
+      </w:pPr>
+      <w:r>
+        <w:t xml:space="preserve">Click a file to show its differences from the master in the report pane below the tree. Double-click opens the report in a separate window, so several files can be viewed side by side. Type in </w:t>
+      </w:r>
+      <w:r>
+        <w:rPr>
+          <w:b/>
+        </w:rPr>
+        <w:t xml:space="preserve">Filter</w:t>
+      </w:r>
+      <w:r>
+        <w:t xml:space="preserve"> (for example Ch A1) to show only matching lines; </w:t>
+      </w:r>
+      <w:r>
+        <w:rPr>
+          <w:b/>
+        </w:rPr>
+        <w:t xml:space="preserve">Save report…</w:t>
+      </w:r>
+      <w:r>
+        <w:t xml:space="preserve"> writes the report to a text file.</w:t>
+      </w:r>
+    </w:p>
+    <w:p>
+      <w:pPr>
+        <w:pStyle w:val="ListNumber"/>
+        <w:numPr>
+          <w:ilvl w:val="0"/>
+          <w:numId w:val="103"/>
+        </w:numPr>
+      </w:pPr>
+      <w:r>
+        <w:t xml:space="preserve">Leave the window open while working in Perception. Files are re-checked every few seconds, so a workbench saved from Perception shows its new result without any further action.</w:t>
+      </w:r>
+    </w:p>
+    <w:p>
+      <w:pPr>
+        <w:spacing w:before="120" w:after="60"/>
+        <w:jc w:val="center"/>
+      </w:pPr>
+      <w:r>
+        <w:drawing>
+          <wp:inline distT="0" distB="0" distL="0" distR="0">
+            <wp:extent cx="5940000" cy="3879078"/>
+            <wp:effectExtent l="0" t="0" r="0" b="0"/>
+            <wp:docPr id="901" name="vwbhist_window.png" descr="The vwbhist window: a folder of workbenches compared with a master reference"/>
+            <wp:cNvGraphicFramePr>
+              <a:graphicFrameLocks xmlns:a="http://schemas.openxmlformats.org/drawingml/2006/main" noChangeAspect="1"/>
+            </wp:cNvGraphicFramePr>
+            <a:graphic xmlns:a="http://schemas.openxmlformats.org/drawingml/2006/main">
+              <a:graphicData uri="http://schemas.openxmlformats.org/drawingml/2006/picture">
+                <pic:pic xmlns:pic="http://schemas.openxmlformats.org/drawingml/2006/picture">
+                  <pic:nvPicPr>
+                    <pic:cNvPr id="901" name="vwbhist_window.png"/>
+                    <pic:cNvPicPr/>
+                  </pic:nvPicPr>
+                  <pic:blipFill>
+                    <a:blip r:embed="rId901"/>
+                    <a:stretch>
+                      <a:fillRect/>
+                    </a:stretch>
+                  </pic:blipFill>
+                  <pic:spPr>
+                    <a:xfrm>
+                      <a:off x="0" y="0"/>
+                      <a:ext cx="5940000" cy="3879078"/>
+                    </a:xfrm>
+                    <a:prstGeom prst="rect">
+                      <a:avLst/>
+                    </a:prstGeom>
+                    <a:ln w="6350">
+                      <a:solidFill>
+                        <a:srgbClr val="BFBFBF"/>
+                      </a:solidFill>
+                    </a:ln>
+                  </pic:spPr>
+                </pic:pic>
+              </a:graphicData>
+            </a:graphic>
+          </wp:inline>
+        </w:drawing>
+      </w:r>
+    </w:p>
+    <w:p>
+      <w:pPr>
+        <w:spacing w:after="200"/>
+        <w:jc w:val="center"/>
+      </w:pPr>
+      <w:r>
+        <w:rPr>
+          <w:i/>
+          <w:sz w:val="18"/>
+          <w:szCs w:val="18"/>
+        </w:rPr>
+        <w:t xml:space="preserve">Figure: the Folder vs reference tab. EPT_SC_demo.pVWB differs from the master six_step_to_PWM.pVWB in 231 settings; the report pane lists them by section.</w:t>
+      </w:r>
+    </w:p>
+    <w:p>
+      <w:pPr>
+        <w:spacing w:after="120"/>
+      </w:pPr>
+      <w:r>
+        <w:t xml:space="preserve">The folder and its master are remembered the next time the window is opened. Right-clicking a file also offers </w:t>
+      </w:r>
+      <w:r>
+        <w:rPr>
+          <w:b/>
+        </w:rPr>
+        <w:t xml:space="preserve">Version history…</w:t>
+      </w:r>
+      <w:r>
+        <w:t xml:space="preserve">, </w:t>
+      </w:r>
+      <w:r>
+        <w:rPr>
+          <w:b/>
+        </w:rPr>
+        <w:t xml:space="preserve">Open in Perception</w:t>
+      </w:r>
+      <w:r>
+        <w:t xml:space="preserve"> and </w:t>
+      </w:r>
+      <w:r>
+        <w:rPr>
+          <w:b/>
+        </w:rPr>
+        <w:t xml:space="preserve">Open containing folder</w:t>
+      </w:r>
+      <w:r>
+        <w:t xml:space="preserve">. The window never writes to the folder unless </w:t>
+      </w:r>
+      <w:r>
+        <w:rPr>
+          <w:b/>
+        </w:rPr>
+        <w:t xml:space="preserve">Also keep a version history</w:t>
+      </w:r>
+      <w:r>
+        <w:t xml:space="preserve"> is ticked (see Procedure 3).</w:t>
+      </w:r>
+    </w:p>
+    <w:p>
+      <w:pPr>
+        <w:pStyle w:val="Heading3"/>
+      </w:pPr>
+      <w:r>
+        <w:t xml:space="preserve">Procedure 2: compare two workbenches</w:t>
       </w:r>
     </w:p>
     <w:p>
@@ -879,7 +1206,46 @@
         </w:numPr>
       </w:pPr>
       <w:r>
-        <w:t xml:space="preserve">Open a command prompt in the vwbhist folder.</w:t>
+        <w:t xml:space="preserve">In the window, open the </w:t>
+      </w:r>
+      <w:r>
+        <w:rPr>
+          <w:b/>
+        </w:rPr>
+        <w:t xml:space="preserve">Compare two files</w:t>
+      </w:r>
+      <w:r>
+        <w:t xml:space="preserve"> tab, select workbench A (before) and B (after) with </w:t>
+      </w:r>
+      <w:r>
+        <w:rPr>
+          <w:b/>
+        </w:rPr>
+        <w:t xml:space="preserve">Browse…</w:t>
+      </w:r>
+      <w:r>
+        <w:t xml:space="preserve"> and click </w:t>
+      </w:r>
+      <w:r>
+        <w:rPr>
+          <w:b/>
+        </w:rPr>
+        <w:t xml:space="preserve">Compare</w:t>
+      </w:r>
+      <w:r>
+        <w:t xml:space="preserve">. The report appears in the lower pane. To use the command line instead, continue with the next steps.</w:t>
+      </w:r>
+    </w:p>
+    <w:p>
+      <w:pPr>
+        <w:pStyle w:val="ListNumber"/>
+        <w:numPr>
+          <w:ilvl w:val="0"/>
+          <w:numId w:val="101"/>
+        </w:numPr>
+      </w:pPr>
+      <w:r>
+        <w:t xml:space="preserve">Command line: open a command prompt in the vwbhist folder.</w:t>
       </w:r>
     </w:p>
     <w:p>
@@ -951,7 +1317,7 @@
         <w:t xml:space="preserve">-v</w:t>
       </w:r>
       <w:r>
-        <w:t xml:space="preserve"> to the command.</w:t>
+        <w:t xml:space="preserve"> to the command (in the window: tick Include display/layout details).</w:t>
       </w:r>
     </w:p>
     <w:p>
@@ -959,7 +1325,7 @@
         <w:pStyle w:val="Heading3"/>
       </w:pPr>
       <w:r>
-        <w:t xml:space="preserve">Procedure 2: keep a version history of a workbench</w:t>
+        <w:t xml:space="preserve">Procedure 3: keep a version history of a workbench</w:t>
       </w:r>
     </w:p>
     <w:p>
@@ -990,29 +1356,43 @@
         </w:numPr>
       </w:pPr>
       <w:r>
-        <w:t xml:space="preserve">Edit the first lines of </w:t>
+        <w:t xml:space="preserve">In the window, open the </w:t>
       </w:r>
       <w:r>
         <w:rPr>
-          <w:rFonts w:ascii="Consolas" w:hAnsi="Consolas" w:cs="Consolas"/>
-          <w:sz w:val="18"/>
-          <w:szCs w:val="18"/>
+          <w:b/>
         </w:rPr>
-        <w:t xml:space="preserve">watch_workbenches.bat</w:t>
+        <w:t xml:space="preserve">History</w:t>
       </w:r>
       <w:r>
-        <w:t xml:space="preserve"> so that </w:t>
+        <w:t xml:space="preserve"> tab, click </w:t>
       </w:r>
       <w:r>
         <w:rPr>
-          <w:rFonts w:ascii="Consolas" w:hAnsi="Consolas" w:cs="Consolas"/>
-          <w:sz w:val="18"/>
-          <w:szCs w:val="18"/>
+          <w:b/>
         </w:rPr>
-        <w:t xml:space="preserve">WB_FOLDER</w:t>
+        <w:t xml:space="preserve">Browse…</w:t>
       </w:r>
       <w:r>
-        <w:t xml:space="preserve"> points to the folder where the workbenches are saved.</w:t>
+        <w:t xml:space="preserve"> and select the workbench (or right-click it in the folder tree and choose </w:t>
+      </w:r>
+      <w:r>
+        <w:rPr>
+          <w:b/>
+        </w:rPr>
+        <w:t xml:space="preserve">Version history…</w:t>
+      </w:r>
+      <w:r>
+        <w:t xml:space="preserve">). Click </w:t>
+      </w:r>
+      <w:r>
+        <w:rPr>
+          <w:b/>
+        </w:rPr>
+        <w:t xml:space="preserve">Snapshot now</w:t>
+      </w:r>
+      <w:r>
+        <w:t xml:space="preserve"> to record its current state, optionally with a note such as "min pulse width set to 5 us".</w:t>
       </w:r>
     </w:p>
     <w:p>
@@ -1024,18 +1404,25 @@
         </w:numPr>
       </w:pPr>
       <w:r>
-        <w:t xml:space="preserve">Double-click </w:t>
+        <w:t xml:space="preserve">Select one version and click </w:t>
       </w:r>
       <w:r>
         <w:rPr>
-          <w:rFonts w:ascii="Consolas" w:hAnsi="Consolas" w:cs="Consolas"/>
-          <w:sz w:val="18"/>
-          <w:szCs w:val="18"/>
+          <w:b/>
         </w:rPr>
-        <w:t xml:space="preserve">watch_workbenches.bat</w:t>
+        <w:t xml:space="preserve">Show changes</w:t>
       </w:r>
       <w:r>
-        <w:t xml:space="preserve"> and leave the window open while working in Perception. Each time Perception saves a workbench in that folder (including subfolders), the change is recorded and the version is listed in the window.</w:t>
+        <w:t xml:space="preserve"> (or double-click it) to see what changed in that save. Select two versions (Ctrl+click) to compare them; </w:t>
+      </w:r>
+      <w:r>
+        <w:rPr>
+          <w:b/>
+        </w:rPr>
+        <w:t xml:space="preserve">Selected vs file on disk</w:t>
+      </w:r>
+      <w:r>
+        <w:t xml:space="preserve"> shows what has changed since a version.</w:t>
       </w:r>
     </w:p>
     <w:p>
@@ -1047,7 +1434,16 @@
         </w:numPr>
       </w:pPr>
       <w:r>
-        <w:t xml:space="preserve">To record a version by hand with a note, drag the workbench onto </w:t>
+        <w:t xml:space="preserve">To record every save automatically, tick </w:t>
+      </w:r>
+      <w:r>
+        <w:rPr>
+          <w:b/>
+        </w:rPr>
+        <w:t xml:space="preserve">Also keep a version history</w:t>
+      </w:r>
+      <w:r>
+        <w:t xml:space="preserve"> on the Folder vs reference tab and leave the window open: each time Perception saves a workbench in the folder, a new version is recorded if its setup changed. Without the window, </w:t>
       </w:r>
       <w:r>
         <w:rPr>
@@ -1055,10 +1451,44 @@
           <w:sz w:val="18"/>
           <w:szCs w:val="18"/>
         </w:rPr>
-        <w:t xml:space="preserve">snapshot_now.bat</w:t>
+        <w:t xml:space="preserve">watch_workbenches.bat</w:t>
       </w:r>
       <w:r>
-        <w:t xml:space="preserve">, or run:</w:t>
+        <w:t xml:space="preserve"> does the same: set </w:t>
+      </w:r>
+      <w:r>
+        <w:rPr>
+          <w:rFonts w:ascii="Consolas" w:hAnsi="Consolas" w:cs="Consolas"/>
+          <w:sz w:val="18"/>
+          <w:szCs w:val="18"/>
+        </w:rPr>
+        <w:t xml:space="preserve">WB_FOLDER</w:t>
+      </w:r>
+      <w:r>
+        <w:t xml:space="preserve"> in its first lines, then double-click it.</w:t>
+      </w:r>
+    </w:p>
+    <w:p>
+      <w:pPr>
+        <w:pStyle w:val="ListNumber"/>
+        <w:numPr>
+          <w:ilvl w:val="0"/>
+          <w:numId w:val="102"/>
+        </w:numPr>
+      </w:pPr>
+      <w:r>
+        <w:t xml:space="preserve">From the command line, record a version by hand with a note (or drag the workbench onto </w:t>
+      </w:r>
+      <w:r>
+        <w:rPr>
+          <w:rFonts w:ascii="Consolas" w:hAnsi="Consolas" w:cs="Consolas"/>
+          <w:sz w:val="18"/>
+          <w:szCs w:val="18"/>
+        </w:rPr>
+        <w:t xml:space="preserve">snapshot_now.bat)</w:t>
+      </w:r>
+      <w:r>
+        <w:t xml:space="preserve">:</w:t>
       </w:r>
     </w:p>
     <w:p>
@@ -1237,7 +1667,7 @@
         <w:t xml:space="preserve">vNNNN_….pVWB</w:t>
       </w:r>
       <w:r>
-        <w:t xml:space="preserve"> copy from the history folder in Perception and save it under the working name.</w:t>
+        <w:t xml:space="preserve"> copy from the history folder in Perception and save it under the working name (in the window: select the version and click Open in Perception).</w:t>
       </w:r>
     </w:p>
     <w:p>
@@ -1568,6 +1998,67 @@
       <w:pPr>
         <w:spacing w:after="120"/>
       </w:pPr>
+    </w:p>
+    <w:p>
+      <w:pPr>
+        <w:pStyle w:val="Heading3"/>
+      </w:pPr>
+      <w:r>
+        <w:t xml:space="preserve">Help in the window</w:t>
+      </w:r>
+    </w:p>
+    <w:p>
+      <w:pPr>
+        <w:pStyle w:val="ListBullet"/>
+      </w:pPr>
+      <w:r>
+        <w:t xml:space="preserve">Hover the mouse over any button, field or file in the tree for a short explanation.</w:t>
+      </w:r>
+    </w:p>
+    <w:p>
+      <w:pPr>
+        <w:pStyle w:val="ListBullet"/>
+      </w:pPr>
+      <w:r>
+        <w:t xml:space="preserve">Press F1 (or click </w:t>
+      </w:r>
+      <w:r>
+        <w:rPr>
+          <w:b/>
+        </w:rPr>
+        <w:t xml:space="preserve">? Help</w:t>
+      </w:r>
+      <w:r>
+        <w:t xml:space="preserve">) to open the help page at the section for the current tab; type in its Filter box to search it.</w:t>
+      </w:r>
+    </w:p>
+    <w:p>
+      <w:pPr>
+        <w:pStyle w:val="ListBullet"/>
+      </w:pPr>
+      <w:r>
+        <w:rPr>
+          <w:b/>
+        </w:rPr>
+        <w:t xml:space="preserve">About</w:t>
+      </w:r>
+      <w:r>
+        <w:t xml:space="preserve"> shows the version, the developer and the support status.</w:t>
+      </w:r>
+    </w:p>
+    <w:p>
+      <w:pPr>
+        <w:pStyle w:val="ListBullet"/>
+      </w:pPr>
+      <w:r>
+        <w:rPr>
+          <w:b/>
+        </w:rPr>
+        <w:t xml:space="preserve">Include display/layout details</w:t>
+      </w:r>
+      <w:r>
+        <w:t xml:space="preserve"> (bottom right) also compares display layout and window details, like -v on the command line.</w:t>
+      </w:r>
     </w:p>
     <w:p>
       <w:pPr>
@@ -2580,7 +3071,7 @@
         <w:t xml:space="preserve">-v</w:t>
       </w:r>
       <w:r>
-        <w:t xml:space="preserve"> to any command to include them.</w:t>
+        <w:t xml:space="preserve"> to any command, or tick Include display/layout details in the window, to include them.</w:t>
       </w:r>
     </w:p>
     <w:p>
@@ -2736,7 +3227,7 @@
         <w:t xml:space="preserve">vwbhist</w:t>
       </w:r>
       <w:r>
-        <w:t xml:space="preserve"> is an unofficial helper and not an HBK-supported product.</w:t>
+        <w:t xml:space="preserve"> is a beta project developed by Kevin Horne. It is provided as is, without support or warranty of any kind, and it is not an official or HBK-supported product.</w:t>
       </w:r>
     </w:p>
     <w:p>
@@ -2838,6 +3329,14 @@
       </w:pPr>
       <w:r>
         <w:t xml:space="preserve">Perception eDrive User Manual A05300_02, chapter 11: RT-FDB formula names used in the examples.</w:t>
+      </w:r>
+    </w:p>
+    <w:p>
+      <w:pPr>
+        <w:pStyle w:val="ListBullet"/>
+      </w:pPr>
+      <w:r>
+        <w:t xml:space="preserve">vwbhist source code, updates and README: https://github.com/krhorne/vwbhist</w:t>
       </w:r>
     </w:p>
     <w:sectPr>

</xml_diff>

<commit_message>
Trim repository to the tool, its docs and the self-test
- removed from the repo (kept locally): VS Code config and workspace,
  install script, test helpers workcopy.py and git_setup.py, the
  snapshot/show/watch launchers, reports placeholder, vwbhist/README.txt
- README.md now holds the full user guide (install, window, command line,
  storage, rollback, git)
- tech note: requirements list the three files and the GitHub download;
  command-line watch replaces watch_workbenches.bat
</commit_message>
<xml_diff>
--- a/EPT_TechNote_XXX_pVWB_Setup_Comparison.docx
+++ b/EPT_TechNote_XXX_pVWB_Setup_Comparison.docx
@@ -764,7 +764,7 @@
         <w:t xml:space="preserve">vwbhist</w:t>
       </w:r>
       <w:r>
-        <w:t xml:space="preserve"> package: </w:t>
+        <w:t xml:space="preserve"> files: </w:t>
       </w:r>
       <w:r>
         <w:rPr>
@@ -786,7 +786,7 @@
         <w:t xml:space="preserve">vwbhist_gui.py</w:t>
       </w:r>
       <w:r>
-        <w:t xml:space="preserve"> (window), the launchers </w:t>
+        <w:t xml:space="preserve"> (window) and </w:t>
       </w:r>
       <w:r>
         <w:rPr>
@@ -797,51 +797,7 @@
         <w:t xml:space="preserve">vwbhist_gui.bat</w:t>
       </w:r>
       <w:r>
-        <w:t xml:space="preserve">, </w:t>
-      </w:r>
-      <w:r>
-        <w:rPr>
-          <w:rFonts w:ascii="Consolas" w:hAnsi="Consolas" w:cs="Consolas"/>
-          <w:sz w:val="18"/>
-          <w:szCs w:val="18"/>
-        </w:rPr>
-        <w:t xml:space="preserve">watch_workbenches.bat</w:t>
-      </w:r>
-      <w:r>
-        <w:t xml:space="preserve">, </w:t>
-      </w:r>
-      <w:r>
-        <w:rPr>
-          <w:rFonts w:ascii="Consolas" w:hAnsi="Consolas" w:cs="Consolas"/>
-          <w:sz w:val="18"/>
-          <w:szCs w:val="18"/>
-        </w:rPr>
-        <w:t xml:space="preserve">snapshot_now.bat</w:t>
-      </w:r>
-      <w:r>
-        <w:t xml:space="preserve"> and </w:t>
-      </w:r>
-      <w:r>
-        <w:rPr>
-          <w:rFonts w:ascii="Consolas" w:hAnsi="Consolas" w:cs="Consolas"/>
-          <w:sz w:val="18"/>
-          <w:szCs w:val="18"/>
-        </w:rPr>
-        <w:t xml:space="preserve">show_last_change.bat</w:t>
-      </w:r>
-      <w:r>
-        <w:t xml:space="preserve">, and </w:t>
-      </w:r>
-      <w:r>
-        <w:rPr>
-          <w:rFonts w:ascii="Consolas" w:hAnsi="Consolas" w:cs="Consolas"/>
-          <w:sz w:val="18"/>
-          <w:szCs w:val="18"/>
-        </w:rPr>
-        <w:t xml:space="preserve">README.txt</w:t>
-      </w:r>
-      <w:r>
-        <w:t xml:space="preserve">. Unzip it to a folder such as C:\Tools\vwbhist. The current version is available from https://github.com/krhorne/vwbhist.</w:t>
+        <w:t xml:space="preserve"> (starts the window), from https://github.com/krhorne/vwbhist (Code → Download ZIP). Copy them to a folder such as C:\Tools\vwbhist.</w:t>
       </w:r>
     </w:p>
     <w:p>
@@ -1443,7 +1399,7 @@
         <w:t xml:space="preserve">Also keep a version history</w:t>
       </w:r>
       <w:r>
-        <w:t xml:space="preserve"> on the Folder vs reference tab and leave the window open: each time Perception saves a workbench in the folder, a new version is recorded if its setup changed. Without the window, </w:t>
+        <w:t xml:space="preserve"> on the Folder vs reference tab and leave the window open: each time Perception saves a workbench in the folder, a new version is recorded if its setup changed. Without the window, run </w:t>
       </w:r>
       <w:r>
         <w:rPr>
@@ -1451,21 +1407,10 @@
           <w:sz w:val="18"/>
           <w:szCs w:val="18"/>
         </w:rPr>
-        <w:t xml:space="preserve">watch_workbenches.bat</w:t>
+        <w:t xml:space="preserve">python vwbhist.py watch "C:\Workbenches"</w:t>
       </w:r>
       <w:r>
-        <w:t xml:space="preserve"> does the same: set </w:t>
-      </w:r>
-      <w:r>
-        <w:rPr>
-          <w:rFonts w:ascii="Consolas" w:hAnsi="Consolas" w:cs="Consolas"/>
-          <w:sz w:val="18"/>
-          <w:szCs w:val="18"/>
-        </w:rPr>
-        <w:t xml:space="preserve">WB_FOLDER</w:t>
-      </w:r>
-      <w:r>
-        <w:t xml:space="preserve"> in its first lines, then double-click it.</w:t>
+        <w:t xml:space="preserve"> in a command prompt and leave it open.</w:t>
       </w:r>
     </w:p>
     <w:p>
@@ -1477,18 +1422,7 @@
         </w:numPr>
       </w:pPr>
       <w:r>
-        <w:t xml:space="preserve">From the command line, record a version by hand with a note (or drag the workbench onto </w:t>
-      </w:r>
-      <w:r>
-        <w:rPr>
-          <w:rFonts w:ascii="Consolas" w:hAnsi="Consolas" w:cs="Consolas"/>
-          <w:sz w:val="18"/>
-          <w:szCs w:val="18"/>
-        </w:rPr>
-        <w:t xml:space="preserve">snapshot_now.bat)</w:t>
-      </w:r>
-      <w:r>
-        <w:t xml:space="preserve">:</w:t>
+        <w:t xml:space="preserve">From the command line, record a version by hand with a note:</w:t>
       </w:r>
     </w:p>
     <w:p>

</xml_diff>